<commit_message>
continuous chat and mode of output
</commit_message>
<xml_diff>
--- a/output.docx
+++ b/output.docx
@@ -4,48 +4,51 @@
   <w:body>
     <w:p>
       <w:r>
-        <w:t>**Who Invented Java?**</w:t>
+        <w:t>**Why Data Science?**</w:t>
         <w:br/>
         <w:br/>
         <w:t>**Introduction**</w:t>
         <w:br/>
-        <w:t>Java is a high-level, object-oriented programming language developed by Sun Microsystems (now owned by Oracle Corporation). The language was created to allow developers to write programs that can run on any platform without modification. In this note, we will explore who invented Java and the story behind its creation.</w:t>
+        <w:br/>
+        <w:t>Data science has become a crucial field in today's digital age, and its importance is only expected to grow. In this notes, we'll explore the reasons why data science is essential for organizations, individuals, and society as a whole.</w:t>
         <w:br/>
         <w:br/>
-        <w:t>**The Inventors of Java**</w:t>
+        <w:t>**Key Points:**</w:t>
         <w:br/>
         <w:br/>
-        <w:t>* **James Gosling**: James Gosling is often referred to as the "father of Java." He is a Canadian computer scientist who worked at Sun Microsystems (now Oracle Corporation) when he developed Java. Gosling was born in 1955 and received his Ph.D. in Computer Science from Carnegie Mellon University.</w:t>
+        <w:t>1. **Unlocking Insights**: Data science helps uncover hidden patterns, trends, and correlations within large datasets, providing valuable insights that inform business decisions, drive innovation, and solve complex problems.</w:t>
         <w:br/>
-        <w:t>* **Mike Sheridan**: Mike Sheridan, another key figure behind Java's creation, was a colleague of James Gosling at Sun Microsystems. He played a crucial role in the development of Java, focusing on its language design and architecture.</w:t>
+        <w:t>2. **Competitive Advantage**: Organizations that leverage data science to gain a deeper understanding of their customers, market trends, and operations can gain a significant competitive advantage over those that don't.</w:t>
         <w:br/>
+        <w:t>3. **Decision-Making**: Data-driven decision-making is becoming increasingly important in today's fast-paced business environment. Data science provides the tools and techniques needed to make informed decisions, reducing uncertainty and risk.</w:t>
         <w:br/>
-        <w:t>**The Story Behind Java**</w:t>
+        <w:t>4. **Improved Customer Experience**: By analyzing customer behavior, preferences, and needs, data science enables organizations to create personalized experiences that drive loyalty, retention, and revenue growth.</w:t>
         <w:br/>
+        <w:t>5. **Cost Reduction**: Data science can help identify areas where costs can be optimized, reduced, or eliminated, leading to significant cost savings and improved financial performance.</w:t>
         <w:br/>
-        <w:t>In the early 1990s, Sun Microsystems wanted to create a new programming language that could be used for developing applications that would run on any platform, including Windows, Macintosh, and Unix-based systems. The goal was to create a language that was platform-independent, allowing developers to write code once and have it run anywhere.</w:t>
+        <w:t>6. **Social Impact**: Data science has the potential to address pressing social issues, such as healthcare, education, and environmental sustainability, by providing valuable insights that inform policy decisions and drive positive change.</w:t>
         <w:br/>
-        <w:br/>
-        <w:t>James Gosling and his team began working on the project in 1991. They drew inspiration from various programming languages, including C++, Smalltalk, and Self. The initial name for the language was "Oak," but it was later changed to Java due to the popularity of coffee beans from Java.</w:t>
-        <w:br/>
-        <w:br/>
-        <w:t>**Key Features of Java**</w:t>
-        <w:br/>
-        <w:br/>
-        <w:t>Java's key features include:</w:t>
-        <w:br/>
-        <w:br/>
-        <w:t>* **Platform Independence**: Java code can run on any platform without modification.</w:t>
-        <w:br/>
-        <w:t>* **Object-Oriented Programming (OOP)**: Java is an OOP language, allowing developers to write reusable code and create complex programs.</w:t>
-        <w:br/>
-        <w:t>* **Dynamic Loading**: Java code can be loaded dynamically into memory, making it suitable for developing web applications.</w:t>
+        <w:t>7. **Job Creation**: The demand for data scientists is on the rise, creating new job opportunities in industries such as finance, healthcare, and government.</w:t>
         <w:br/>
         <w:br/>
         <w:t>**Conclusion**</w:t>
         <w:br/>
         <w:br/>
-        <w:t>In conclusion, James Gosling, Mike Sheridan, and their team at Sun Microsystems (now Oracle Corporation) invented Java. The language was created to provide platform independence and object-oriented programming capabilities. Today, Java is one of the most popular programming languages in the world, used for developing a wide range of applications, from mobile devices to web servers.</w:t>
+        <w:t>Data science is a critical component of modern business strategy, enabling organizations to gain a deeper understanding of their customers, market trends, and operations. By leveraging data science, organizations can drive innovation, improve decision-making, and create new opportunities for growth. As the field continues to evolve, it's essential to recognize the value that data science brings to both individuals and society as a whole.</w:t>
+        <w:br/>
+        <w:br/>
+        <w:t>**Key Takeaways:**</w:t>
+        <w:br/>
+        <w:br/>
+        <w:t>* Data science unlocks insights that inform business decisions and solve complex problems.</w:t>
+        <w:br/>
+        <w:t>* It provides a competitive advantage by helping organizations understand their customers, market trends, and operations.</w:t>
+        <w:br/>
+        <w:t>* Data-driven decision-making is critical in today's fast-paced business environment.</w:t>
+        <w:br/>
+        <w:t>* Data science improves customer experiences, reduces costs, and has the potential to address pressing social issues.</w:t>
+        <w:br/>
+        <w:t>* The demand for data scientists is on the rise, creating new job opportunities.</w:t>
       </w:r>
     </w:p>
     <w:sectPr>

</xml_diff>

<commit_message>
fix: readme , api
</commit_message>
<xml_diff>
--- a/output.docx
+++ b/output.docx
@@ -4,174 +4,7 @@
   <w:body>
     <w:p>
       <w:r>
-        <w:t>Here are detailed notes on the different types of testing:</w:t>
-        <w:br/>
-        <w:br/>
-        <w:t>**I. Unit Testing**</w:t>
-        <w:br/>
-        <w:br/>
-        <w:t>* Definition: Verifies that individual units of code, such as functions or methods, work correctly.</w:t>
-        <w:br/>
-        <w:t>* Purpose: Ensures that each unit of code is functioning as expected before moving on to the next step in the development process.</w:t>
-        <w:br/>
-        <w:t>* Characteristics:</w:t>
-        <w:br/>
-        <w:tab/>
-        <w:t>+ Focuses on a single unit of code</w:t>
-        <w:br/>
-        <w:tab/>
-        <w:t>+ Typically uses mock objects or fake data to isolate the unit under test</w:t>
-        <w:br/>
-        <w:tab/>
-        <w:t>+ Tests specific scenarios and edge cases</w:t>
-        <w:br/>
-        <w:tab/>
-        <w:t>+ Can be automated using frameworks like JUnit or NUnit</w:t>
-        <w:br/>
-        <w:br/>
-        <w:t>**II. Integration Testing**</w:t>
-        <w:br/>
-        <w:br/>
-        <w:t>* Definition: Verifies that different units of code work together correctly.</w:t>
-        <w:br/>
-        <w:t>* Purpose: Ensures that the interactions between different parts of the system are functioning as expected.</w:t>
-        <w:br/>
-        <w:t>* Characteristics:</w:t>
-        <w:br/>
-        <w:tab/>
-        <w:t>+ Focuses on the interactions between multiple units of code</w:t>
-        <w:br/>
-        <w:tab/>
-        <w:t>+ Typically uses real data and actual dependencies</w:t>
-        <w:br/>
-        <w:tab/>
-        <w:t>+ Tests specific scenarios and edge cases, such as error handling and boundary conditions</w:t>
-        <w:br/>
-        <w:tab/>
-        <w:t>+ Can be automated using frameworks like Selenium or Cucumber</w:t>
-        <w:br/>
-        <w:br/>
-        <w:t>**III. Functional Testing**</w:t>
-        <w:br/>
-        <w:br/>
-        <w:t>* Definition: Verifies that the system meets its functional requirements.</w:t>
-        <w:br/>
-        <w:t>* Purpose: Ensures that the system behaves as expected in different scenarios and user interactions.</w:t>
-        <w:br/>
-        <w:t>* Characteristics:</w:t>
-        <w:br/>
-        <w:tab/>
-        <w:t>+ Focuses on the overall behavior of the system</w:t>
-        <w:br/>
-        <w:tab/>
-        <w:t>+ Typically uses real data and actual dependencies</w:t>
-        <w:br/>
-        <w:tab/>
-        <w:t>+ Tests specific features, workflows, and user stories</w:t>
-        <w:br/>
-        <w:tab/>
-        <w:t>+ Can be automated using frameworks like TestComplete or Robot Framework</w:t>
-        <w:br/>
-        <w:br/>
-        <w:t>**IV. Acceptance Testing**</w:t>
-        <w:br/>
-        <w:br/>
-        <w:t>* Definition: Verifies that the system meets its acceptance criteria.</w:t>
-        <w:br/>
-        <w:t>* Purpose: Ensures that the system is ready for release to production.</w:t>
-        <w:br/>
-        <w:t>* Characteristics:</w:t>
-        <w:br/>
-        <w:tab/>
-        <w:t>+ Focuses on the overall behavior of the system</w:t>
-        <w:br/>
-        <w:tab/>
-        <w:t>+ Typically uses real data and actual dependencies</w:t>
-        <w:br/>
-        <w:tab/>
-        <w:t>+ Tests specific features, workflows, and user stories</w:t>
-        <w:br/>
-        <w:tab/>
-        <w:t>+ Can be automated using frameworks like Cucumber or Behave</w:t>
-        <w:br/>
-        <w:br/>
-        <w:t>**V. Regression Testing**</w:t>
-        <w:br/>
-        <w:br/>
-        <w:t>* Definition: Verifies that changes to the system do not introduce new bugs.</w:t>
-        <w:br/>
-        <w:t>* Purpose: Ensures that the system continues to function correctly after changes are made.</w:t>
-        <w:br/>
-        <w:t>* Characteristics:</w:t>
-        <w:br/>
-        <w:tab/>
-        <w:t>+ Focuses on verifying that existing functionality is still working correctly</w:t>
-        <w:br/>
-        <w:tab/>
-        <w:t>+ Typically uses a combination of automated and manual testing</w:t>
-        <w:br/>
-        <w:tab/>
-        <w:t>+ Tests specific scenarios and edge cases, such as error handling and boundary conditions</w:t>
-        <w:br/>
-        <w:br/>
-        <w:t>**VI. Performance Testing**</w:t>
-        <w:br/>
-        <w:br/>
-        <w:t>* Definition: Verifies that the system can handle a certain level of load.</w:t>
-        <w:br/>
-        <w:t>* Purpose: Ensures that the system performs well under different usage patterns.</w:t>
-        <w:br/>
-        <w:t>* Characteristics:</w:t>
-        <w:br/>
-        <w:tab/>
-        <w:t>+ Focuses on measuring the performance of the system</w:t>
-        <w:br/>
-        <w:tab/>
-        <w:t>+ Typically uses real data and actual dependencies</w:t>
-        <w:br/>
-        <w:tab/>
-        <w:t>+ Tests specific scenarios, such as high traffic or concurrent user interactions</w:t>
-        <w:br/>
-        <w:br/>
-        <w:t>**VII. Security Testing**</w:t>
-        <w:br/>
-        <w:br/>
-        <w:t>* Definition: Verifies that the system is secure and resistant to attacks.</w:t>
-        <w:br/>
-        <w:t>* Purpose: Ensures that the system protects sensitive data and prevents unauthorized access.</w:t>
-        <w:br/>
-        <w:t>* Characteristics:</w:t>
-        <w:br/>
-        <w:tab/>
-        <w:t>+ Focuses on identifying vulnerabilities and weaknesses in the system</w:t>
-        <w:br/>
-        <w:tab/>
-        <w:t>+ Typically uses real data and actual dependencies</w:t>
-        <w:br/>
-        <w:tab/>
-        <w:t>+ Tests specific scenarios, such as authentication and authorization</w:t>
-        <w:br/>
-        <w:br/>
-        <w:t>**VIII. Usability Testing**</w:t>
-        <w:br/>
-        <w:br/>
-        <w:t>* Definition: Verifies that the system is easy to use and understand.</w:t>
-        <w:br/>
-        <w:t>* Purpose: Ensures that the system provides a good user experience.</w:t>
-        <w:br/>
-        <w:t>* Characteristics:</w:t>
-        <w:br/>
-        <w:tab/>
-        <w:t>+ Focuses on measuring the usability of the system</w:t>
-        <w:br/>
-        <w:tab/>
-        <w:t>+ Typically uses real users or mock users</w:t>
-        <w:br/>
-        <w:tab/>
-        <w:t>+ Tests specific scenarios, such as user interactions and workflows</w:t>
-        <w:br/>
-        <w:br/>
-        <w:t>These notes provide</w:t>
+        <w:t>❌ Error: Error code: 404 - {'error': {'message': 'The model `groq/mixtral-8x7b-32768` does not exist or you do not have access to it.', 'type': 'invalid_request_error', 'code': 'model_not_found'}}</w:t>
       </w:r>
     </w:p>
     <w:sectPr>

</xml_diff>